<commit_message>
Diplom sodda tilga o'tkazildi: Humo, ustunliklar, keyingi bosqich rejalari
- Butun matn (kirish, I-IV boblar, xulosa, annotatsiya) sodda tilda qayta yozildi
- Humo messenjeri tahlilga va 1.1-jadvalga qo'shildi
- Ustunliklar, keyingi bosqich talablari (AI, bozor va tenderlar, blokcheyn) qo'shildi
- Elektron kooperatsiya portali amaliy joriy etish sifatida yozildi
- Taqriz endi taqrizchining RTM.docx fayli, generator faqat rahbar xulosasini yaratadi
- Taqdimot yangilandi (26 slayd), qolgan ishlar KEYINGI-QADAMLAR.md da

Co-Authored-By: Claude Opus 5.5 <noreply@anthropic.com>
</commit_message>
<xml_diff>
--- a/diplom/Rahbar_xulosasi_Sohinazarov_Sardor.docx
+++ b/diplom/Rahbar_xulosasi_Sohinazarov_Sardor.docx
@@ -84,7 +84,7 @@
         <w:jc w:val="both"/>
       </w:pPr>
       <w:r>
-        <w:t xml:space="preserve">Ushbu diplom loyihasi foydalanuvchi ma’lumotlarini o‘z serverida saqlaydigan, shaxsiy va guruh yozishmalarida real vaqtda xabar almashish imkonini beruvchi “Milliy” xabarchini ishlab chiqishga bag‘ishlangan. Muallif to‘liq ishlaydigan veb-ilova yaratgan, u tashkilotlarda ichki muloqot vositasi sifatida amaliy ahamiyatga ega.</w:t>
+        <w:t xml:space="preserve">Ushbu diplom loyihasi foydalanuvchi ma’lumotlarini o‘z serverida saqlaydigan, shaxsiy va guruh yozishmalarida xabarlarni real vaqtda yetkazadigan “Milliy” xabarchini ishlab chiqishga bag‘ishlangan. Muallif to‘liq ishlaydigan veb-ilova yaratgan. Uning chat texnologiyasi Elektron kooperatsiya portalida kompaniyalar o‘rtasidagi chat modulini yaratishda qo‘llanilgan.</w:t>
       </w:r>
     </w:p>
     <w:p>
@@ -94,7 +94,7 @@
         <w:jc w:val="both"/>
       </w:pPr>
       <w:r>
-        <w:t xml:space="preserve">Tizim arxitekturasi, ma’lumotlar bazasi modeli va foydalanuvchi rollari UML diagrammalar orqali ifodalangan. Dasturiy yechim .NET 8, ASP.NET Core, SignalR, PostgreSQL va Angular texnologiyalari asosida Clean Architecture tamoyillari bo‘yicha ishlab chiqilgan. Lotin–kirill transliteratsiyasi, tashkilot rejimi, uchdan-uchgacha shifrlangan maxfiy chatlar, xabarlarga reaksiyalar, bloklash va forum amalga oshirilgan, dastur Docker’da joylashtirilib, testlar bilan sinalgan.</w:t>
+        <w:t xml:space="preserve">Tizim tuzilishi, ma’lumotlar bazasi va foydalanuvchi rollari UML diagrammalar bilan ifodalangan. Server .NET muhitida, Entity Framework asosida, brauzer qismi esa Angular’da yozilgan, xabarlar SignalR orqali yetkaziladi. Lotin–kirill o‘girish, tashkilot rejimi, maxfiy chatlar, xabarlarga reaksiyalar, bloklash va forum amalga oshirilgan. Dasturni joylashtirish uchun Docker’dan foydalanilgan, dastur testlar bilan sinalgan.</w:t>
       </w:r>
     </w:p>
     <w:p>

</xml_diff>